<commit_message>
curricular form replacer impl
</commit_message>
<xml_diff>
--- a/src/main/resources/formulario_componente_curricular.docx
+++ b/src/main/resources/formulario_componente_curricular.docx
@@ -12,9 +12,7 @@
         </w:rPr>
       </w:pPr>
       <w:r>
-        <w:rPr>
-          <w:rFonts w:ascii="Times New Roman" w:hAnsi="Times New Roman"/>
-        </w:rPr>
+        <w:rPr/>
         <w:drawing>
           <wp:inline distT="0" distB="0" distL="0" distR="0">
             <wp:extent cx="1905000" cy="952500"/>
@@ -62,8 +60,6 @@
         <w:jc w:val="center"/>
         <w:rPr>
           <w:rFonts w:ascii="Times New Roman" w:hAnsi="Times New Roman"/>
-          <w:b/>
-          <w:bCs/>
         </w:rPr>
       </w:pPr>
       <w:r>
@@ -82,8 +78,6 @@
         <w:jc w:val="center"/>
         <w:rPr>
           <w:rFonts w:ascii="Times New Roman" w:hAnsi="Times New Roman"/>
-          <w:b/>
-          <w:bCs/>
         </w:rPr>
       </w:pPr>
       <w:r>
@@ -97,18 +91,14 @@
     </w:p>
     <w:p>
       <w:pPr>
-        <w:pStyle w:val="Normal"/>
-        <w:bidi w:val="0"/>
-        <w:jc w:val="center"/>
-        <w:rPr>
-          <w:rFonts w:ascii="Times New Roman" w:hAnsi="Times New Roman"/>
-          <w:b/>
-          <w:bCs/>
-        </w:rPr>
-      </w:pPr>
-      <w:r>
-        <w:rPr>
-          <w:rFonts w:ascii="Times New Roman" w:hAnsi="Times New Roman"/>
+        <w:pStyle w:val="Header"/>
+        <w:rPr>
+          <w:b/>
+          <w:bCs/>
+        </w:rPr>
+      </w:pPr>
+      <w:r>
+        <w:rPr>
           <w:b/>
           <w:bCs/>
         </w:rPr>
@@ -116,78 +106,80 @@
       </w:r>
       <w:r>
         <w:rPr>
-          <w:rFonts w:ascii="Times New Roman" w:hAnsi="Times New Roman"/>
+          <w:rFonts w:eastAsia="Times New Roman" w:cs="Times New Roman"/>
           <w:b/>
           <w:bCs/>
           <w:i/>
           <w:iCs/>
+          <w:sz w:val="24"/>
+          <w:szCs w:val="24"/>
         </w:rPr>
         <w:t>CAMPUS</w:t>
       </w:r>
       <w:r>
         <w:rPr>
-          <w:rFonts w:ascii="Times New Roman" w:hAnsi="Times New Roman"/>
-          <w:b/>
-          <w:bCs/>
-        </w:rPr>
-        <w:t xml:space="preserve"> {{CAMPUS}}</w:t>
-      </w:r>
-    </w:p>
-    <w:p>
-      <w:pPr>
-        <w:pStyle w:val="Normal"/>
-        <w:bidi w:val="0"/>
-        <w:jc w:val="center"/>
-        <w:rPr>
-          <w:rFonts w:ascii="Times New Roman" w:hAnsi="Times New Roman"/>
-          <w:b/>
-          <w:bCs/>
-        </w:rPr>
-      </w:pPr>
-      <w:r>
-        <w:rPr>
-          <w:rFonts w:ascii="Times New Roman" w:hAnsi="Times New Roman"/>
-          <w:b/>
-          <w:bCs/>
-        </w:rPr>
-      </w:r>
-    </w:p>
-    <w:p>
-      <w:pPr>
-        <w:pStyle w:val="Normal"/>
-        <w:bidi w:val="0"/>
-        <w:jc w:val="center"/>
-        <w:rPr>
-          <w:rFonts w:ascii="Times New Roman" w:hAnsi="Times New Roman"/>
-          <w:b/>
-          <w:bCs/>
-        </w:rPr>
-      </w:pPr>
-      <w:r>
-        <w:rPr>
-          <w:rFonts w:ascii="Times New Roman" w:hAnsi="Times New Roman"/>
-          <w:b/>
-          <w:bCs/>
-        </w:rPr>
-      </w:r>
-    </w:p>
-    <w:p>
-      <w:pPr>
-        <w:pStyle w:val="Normal"/>
-        <w:bidi w:val="0"/>
-        <w:jc w:val="center"/>
+          <w:rFonts w:eastAsia="Times New Roman" w:cs="Times New Roman"/>
+          <w:b/>
+          <w:bCs/>
+          <w:sz w:val="24"/>
+          <w:szCs w:val="24"/>
+        </w:rPr>
+        <w:t xml:space="preserve"> {{campus}}</w:t>
+      </w:r>
+    </w:p>
+    <w:p>
+      <w:pPr>
+        <w:pStyle w:val="Normal"/>
+        <w:bidi w:val="0"/>
+        <w:jc w:val="center"/>
+        <w:rPr>
+          <w:rFonts w:ascii="Times New Roman" w:hAnsi="Times New Roman"/>
+          <w:b/>
+          <w:bCs/>
+        </w:rPr>
+      </w:pPr>
+      <w:r>
+        <w:rPr>
+          <w:rFonts w:ascii="Times New Roman" w:hAnsi="Times New Roman"/>
+          <w:b/>
+          <w:bCs/>
+        </w:rPr>
+      </w:r>
+    </w:p>
+    <w:p>
+      <w:pPr>
+        <w:pStyle w:val="Normal"/>
+        <w:bidi w:val="0"/>
+        <w:jc w:val="center"/>
+        <w:rPr>
+          <w:rFonts w:ascii="Times New Roman" w:hAnsi="Times New Roman"/>
+          <w:b/>
+          <w:bCs/>
+        </w:rPr>
+      </w:pPr>
+      <w:r>
+        <w:rPr>
+          <w:rFonts w:ascii="Times New Roman" w:hAnsi="Times New Roman"/>
+          <w:b/>
+          <w:bCs/>
+        </w:rPr>
+      </w:r>
+    </w:p>
+    <w:p>
+      <w:pPr>
+        <w:pStyle w:val="Normal"/>
+        <w:bidi w:val="0"/>
+        <w:jc w:val="center"/>
+        <w:rPr>
+          <w:rFonts w:ascii="Times New Roman" w:hAnsi="Times New Roman"/>
+        </w:rPr>
+      </w:pPr>
+      <w:r>
         <w:rPr>
           <w:rFonts w:ascii="Times New Roman" w:hAnsi="Times New Roman"/>
           <w:b w:val="false"/>
           <w:bCs w:val="false"/>
         </w:rPr>
-      </w:pPr>
-      <w:r>
-        <w:rPr>
-          <w:rFonts w:ascii="Times New Roman" w:hAnsi="Times New Roman"/>
-          <w:b w:val="false"/>
-          <w:bCs w:val="false"/>
-        </w:rPr>
         <w:t>PROGRAMA DE COMPONENTE CURRICULAR</w:t>
       </w:r>
     </w:p>
@@ -208,71 +200,63 @@
     </w:p>
     <w:p>
       <w:pPr>
-        <w:pStyle w:val="Normal"/>
-        <w:bidi w:val="0"/>
-        <w:jc w:val="center"/>
-        <w:rPr>
-          <w:rFonts w:ascii="Times New Roman" w:hAnsi="Times New Roman"/>
-          <w:b/>
-          <w:bCs/>
-        </w:rPr>
-      </w:pPr>
-      <w:r>
-        <w:rPr>
-          <w:rFonts w:ascii="Times New Roman" w:hAnsi="Times New Roman"/>
-          <w:b/>
-          <w:bCs/>
-        </w:rPr>
-        <w:t>CURSO SUPERIOR DE {{NOME_DO_CURSO}}</w:t>
-      </w:r>
-    </w:p>
-    <w:p>
-      <w:pPr>
-        <w:pStyle w:val="Normal"/>
-        <w:bidi w:val="0"/>
-        <w:jc w:val="center"/>
-        <w:rPr>
-          <w:rFonts w:ascii="Times New Roman" w:hAnsi="Times New Roman"/>
-          <w:b/>
-          <w:bCs/>
-        </w:rPr>
-      </w:pPr>
-      <w:r>
-        <w:rPr>
-          <w:rFonts w:ascii="Times New Roman" w:hAnsi="Times New Roman"/>
-          <w:b/>
-          <w:bCs/>
-        </w:rPr>
-      </w:r>
-    </w:p>
-    <w:p>
-      <w:pPr>
-        <w:pStyle w:val="Normal"/>
-        <w:bidi w:val="0"/>
-        <w:jc w:val="center"/>
-        <w:rPr>
-          <w:rFonts w:ascii="Times New Roman" w:hAnsi="Times New Roman"/>
-          <w:b/>
-          <w:bCs/>
-        </w:rPr>
-      </w:pPr>
-      <w:r>
-        <w:rPr>
-          <w:rFonts w:ascii="Times New Roman" w:hAnsi="Times New Roman"/>
-          <w:b/>
-          <w:bCs/>
-        </w:rPr>
-      </w:r>
-    </w:p>
-    <w:p>
-      <w:pPr>
-        <w:pStyle w:val="Normal"/>
-        <w:bidi w:val="0"/>
-        <w:jc w:val="center"/>
-        <w:rPr>
-          <w:rFonts w:ascii="Times New Roman" w:hAnsi="Times New Roman"/>
-          <w:b/>
-          <w:bCs/>
+        <w:pStyle w:val="Header"/>
+        <w:rPr>
+          <w:rFonts w:ascii="Times New Roman" w:hAnsi="Times New Roman"/>
+          <w:b/>
+          <w:bCs/>
+        </w:rPr>
+      </w:pPr>
+      <w:r>
+        <w:rPr/>
+        <w:t>CURSO SUPERIOR DE {{nome_do_curso}}</w:t>
+      </w:r>
+    </w:p>
+    <w:p>
+      <w:pPr>
+        <w:pStyle w:val="Normal"/>
+        <w:bidi w:val="0"/>
+        <w:jc w:val="center"/>
+        <w:rPr>
+          <w:rFonts w:ascii="Times New Roman" w:hAnsi="Times New Roman"/>
+          <w:b/>
+          <w:bCs/>
+        </w:rPr>
+      </w:pPr>
+      <w:r>
+        <w:rPr>
+          <w:rFonts w:ascii="Times New Roman" w:hAnsi="Times New Roman"/>
+          <w:b/>
+          <w:bCs/>
+        </w:rPr>
+      </w:r>
+    </w:p>
+    <w:p>
+      <w:pPr>
+        <w:pStyle w:val="Normal"/>
+        <w:bidi w:val="0"/>
+        <w:jc w:val="center"/>
+        <w:rPr>
+          <w:rFonts w:ascii="Times New Roman" w:hAnsi="Times New Roman"/>
+          <w:b/>
+          <w:bCs/>
+        </w:rPr>
+      </w:pPr>
+      <w:r>
+        <w:rPr>
+          <w:rFonts w:ascii="Times New Roman" w:hAnsi="Times New Roman"/>
+          <w:b/>
+          <w:bCs/>
+        </w:rPr>
+      </w:r>
+    </w:p>
+    <w:p>
+      <w:pPr>
+        <w:pStyle w:val="Normal"/>
+        <w:bidi w:val="0"/>
+        <w:jc w:val="center"/>
+        <w:rPr>
+          <w:rFonts w:ascii="Times New Roman" w:hAnsi="Times New Roman"/>
         </w:rPr>
       </w:pPr>
       <w:r>
@@ -317,16 +301,16 @@
         </w:tblCellMar>
       </w:tblPr>
       <w:tblGrid>
-        <w:gridCol w:w="762"/>
-        <w:gridCol w:w="3853"/>
-        <w:gridCol w:w="393"/>
-        <w:gridCol w:w="4063"/>
+        <w:gridCol w:w="761"/>
+        <w:gridCol w:w="3854"/>
+        <w:gridCol w:w="599"/>
+        <w:gridCol w:w="3857"/>
       </w:tblGrid>
       <w:tr>
         <w:trPr/>
         <w:tc>
           <w:tcPr>
-            <w:tcW w:w="762" w:type="dxa"/>
+            <w:tcW w:w="761" w:type="dxa"/>
             <w:tcBorders>
               <w:top w:val="single" w:sz="2" w:space="0" w:color="000000"/>
               <w:left w:val="single" w:sz="2" w:space="0" w:color="000000"/>
@@ -356,7 +340,7 @@
         </w:tc>
         <w:tc>
           <w:tcPr>
-            <w:tcW w:w="3853" w:type="dxa"/>
+            <w:tcW w:w="3854" w:type="dxa"/>
             <w:tcBorders>
               <w:top w:val="single" w:sz="2" w:space="0" w:color="000000"/>
               <w:left w:val="single" w:sz="2" w:space="0" w:color="000000"/>
@@ -383,7 +367,7 @@
         </w:tc>
         <w:tc>
           <w:tcPr>
-            <w:tcW w:w="393" w:type="dxa"/>
+            <w:tcW w:w="599" w:type="dxa"/>
             <w:tcBorders>
               <w:top w:val="single" w:sz="2" w:space="0" w:color="000000"/>
               <w:left w:val="single" w:sz="2" w:space="0" w:color="000000"/>
@@ -413,7 +397,7 @@
         </w:tc>
         <w:tc>
           <w:tcPr>
-            <w:tcW w:w="4063" w:type="dxa"/>
+            <w:tcW w:w="3857" w:type="dxa"/>
             <w:tcBorders>
               <w:top w:val="single" w:sz="2" w:space="0" w:color="000000"/>
               <w:left w:val="single" w:sz="2" w:space="0" w:color="000000"/>
@@ -444,7 +428,7 @@
         <w:trPr/>
         <w:tc>
           <w:tcPr>
-            <w:tcW w:w="762" w:type="dxa"/>
+            <w:tcW w:w="761" w:type="dxa"/>
             <w:tcBorders>
               <w:left w:val="single" w:sz="2" w:space="0" w:color="000000"/>
               <w:bottom w:val="single" w:sz="2" w:space="0" w:color="000000"/>
@@ -473,7 +457,7 @@
         </w:tc>
         <w:tc>
           <w:tcPr>
-            <w:tcW w:w="3853" w:type="dxa"/>
+            <w:tcW w:w="3854" w:type="dxa"/>
             <w:tcBorders>
               <w:left w:val="single" w:sz="2" w:space="0" w:color="000000"/>
               <w:bottom w:val="single" w:sz="2" w:space="0" w:color="000000"/>
@@ -499,7 +483,7 @@
         </w:tc>
         <w:tc>
           <w:tcPr>
-            <w:tcW w:w="393" w:type="dxa"/>
+            <w:tcW w:w="599" w:type="dxa"/>
             <w:tcBorders>
               <w:left w:val="single" w:sz="2" w:space="0" w:color="000000"/>
               <w:bottom w:val="single" w:sz="2" w:space="0" w:color="000000"/>
@@ -528,7 +512,7 @@
         </w:tc>
         <w:tc>
           <w:tcPr>
-            <w:tcW w:w="4063" w:type="dxa"/>
+            <w:tcW w:w="3857" w:type="dxa"/>
             <w:tcBorders>
               <w:left w:val="single" w:sz="2" w:space="0" w:color="000000"/>
               <w:bottom w:val="single" w:sz="2" w:space="0" w:color="000000"/>
@@ -600,8 +584,6 @@
         <w:jc w:val="center"/>
         <w:rPr>
           <w:rFonts w:ascii="Times New Roman" w:hAnsi="Times New Roman"/>
-          <w:b/>
-          <w:bCs/>
         </w:rPr>
       </w:pPr>
       <w:r>
@@ -646,18 +628,18 @@
         </w:tblCellMar>
       </w:tblPr>
       <w:tblGrid>
-        <w:gridCol w:w="762"/>
-        <w:gridCol w:w="2261"/>
+        <w:gridCol w:w="761"/>
+        <w:gridCol w:w="2262"/>
         <w:gridCol w:w="519"/>
         <w:gridCol w:w="2505"/>
-        <w:gridCol w:w="495"/>
-        <w:gridCol w:w="2529"/>
+        <w:gridCol w:w="494"/>
+        <w:gridCol w:w="2530"/>
       </w:tblGrid>
       <w:tr>
         <w:trPr/>
         <w:tc>
           <w:tcPr>
-            <w:tcW w:w="762" w:type="dxa"/>
+            <w:tcW w:w="761" w:type="dxa"/>
             <w:tcBorders>
               <w:top w:val="single" w:sz="2" w:space="0" w:color="000000"/>
               <w:left w:val="single" w:sz="2" w:space="0" w:color="000000"/>
@@ -686,7 +668,7 @@
         </w:tc>
         <w:tc>
           <w:tcPr>
-            <w:tcW w:w="2261" w:type="dxa"/>
+            <w:tcW w:w="2262" w:type="dxa"/>
             <w:tcBorders>
               <w:top w:val="single" w:sz="2" w:space="0" w:color="000000"/>
               <w:left w:val="single" w:sz="2" w:space="0" w:color="000000"/>
@@ -767,7 +749,7 @@
         </w:tc>
         <w:tc>
           <w:tcPr>
-            <w:tcW w:w="495" w:type="dxa"/>
+            <w:tcW w:w="494" w:type="dxa"/>
             <w:tcBorders>
               <w:top w:val="single" w:sz="2" w:space="0" w:color="000000"/>
               <w:left w:val="single" w:sz="2" w:space="0" w:color="000000"/>
@@ -796,7 +778,7 @@
         </w:tc>
         <w:tc>
           <w:tcPr>
-            <w:tcW w:w="2529" w:type="dxa"/>
+            <w:tcW w:w="2530" w:type="dxa"/>
             <w:tcBorders>
               <w:top w:val="single" w:sz="2" w:space="0" w:color="000000"/>
               <w:left w:val="single" w:sz="2" w:space="0" w:color="000000"/>
@@ -849,8 +831,6 @@
         <w:jc w:val="center"/>
         <w:rPr>
           <w:rFonts w:ascii="Times New Roman" w:hAnsi="Times New Roman"/>
-          <w:b/>
-          <w:bCs/>
         </w:rPr>
       </w:pPr>
       <w:r>
@@ -897,9 +877,9 @@
       <w:tblGrid>
         <w:gridCol w:w="1511"/>
         <w:gridCol w:w="1212"/>
-        <w:gridCol w:w="1212"/>
-        <w:gridCol w:w="1811"/>
-        <w:gridCol w:w="1027"/>
+        <w:gridCol w:w="1211"/>
+        <w:gridCol w:w="1807"/>
+        <w:gridCol w:w="1032"/>
         <w:gridCol w:w="1073"/>
         <w:gridCol w:w="1225"/>
       </w:tblGrid>
@@ -922,8 +902,6 @@
               <w:jc w:val="center"/>
               <w:rPr>
                 <w:rFonts w:ascii="Times New Roman" w:hAnsi="Times New Roman"/>
-                <w:b/>
-                <w:bCs/>
               </w:rPr>
             </w:pPr>
             <w:r>
@@ -938,7 +916,7 @@
         </w:tc>
         <w:tc>
           <w:tcPr>
-            <w:tcW w:w="2424" w:type="dxa"/>
+            <w:tcW w:w="2423" w:type="dxa"/>
             <w:gridSpan w:val="2"/>
             <w:tcBorders>
               <w:top w:val="single" w:sz="2" w:space="0" w:color="000000"/>
@@ -953,8 +931,6 @@
               <w:jc w:val="center"/>
               <w:rPr>
                 <w:rFonts w:ascii="Times New Roman" w:hAnsi="Times New Roman"/>
-                <w:b/>
-                <w:bCs/>
               </w:rPr>
             </w:pPr>
             <w:r>
@@ -969,7 +945,7 @@
         </w:tc>
         <w:tc>
           <w:tcPr>
-            <w:tcW w:w="1811" w:type="dxa"/>
+            <w:tcW w:w="1807" w:type="dxa"/>
             <w:tcBorders>
               <w:top w:val="single" w:sz="2" w:space="0" w:color="000000"/>
               <w:left w:val="single" w:sz="2" w:space="0" w:color="000000"/>
@@ -983,8 +959,6 @@
               <w:jc w:val="center"/>
               <w:rPr>
                 <w:rFonts w:ascii="Times New Roman" w:hAnsi="Times New Roman"/>
-                <w:b/>
-                <w:bCs/>
               </w:rPr>
             </w:pPr>
             <w:r>
@@ -999,7 +973,7 @@
         </w:tc>
         <w:tc>
           <w:tcPr>
-            <w:tcW w:w="1027" w:type="dxa"/>
+            <w:tcW w:w="1032" w:type="dxa"/>
             <w:tcBorders>
               <w:top w:val="single" w:sz="2" w:space="0" w:color="000000"/>
               <w:left w:val="single" w:sz="2" w:space="0" w:color="000000"/>
@@ -1013,8 +987,6 @@
               <w:jc w:val="center"/>
               <w:rPr>
                 <w:rFonts w:ascii="Times New Roman" w:hAnsi="Times New Roman"/>
-                <w:b/>
-                <w:bCs/>
               </w:rPr>
             </w:pPr>
             <w:r>
@@ -1043,8 +1015,6 @@
               <w:jc w:val="center"/>
               <w:rPr>
                 <w:rFonts w:ascii="Times New Roman" w:hAnsi="Times New Roman"/>
-                <w:b/>
-                <w:bCs/>
               </w:rPr>
             </w:pPr>
             <w:r>
@@ -1063,8 +1033,6 @@
               <w:jc w:val="center"/>
               <w:rPr>
                 <w:rFonts w:ascii="Times New Roman" w:hAnsi="Times New Roman"/>
-                <w:b/>
-                <w:bCs/>
               </w:rPr>
             </w:pPr>
             <w:r>
@@ -1094,8 +1062,6 @@
               <w:jc w:val="center"/>
               <w:rPr>
                 <w:rFonts w:ascii="Times New Roman" w:hAnsi="Times New Roman"/>
-                <w:b/>
-                <w:bCs/>
               </w:rPr>
             </w:pPr>
             <w:r>
@@ -1154,8 +1120,6 @@
               <w:jc w:val="center"/>
               <w:rPr>
                 <w:rFonts w:ascii="Times New Roman" w:hAnsi="Times New Roman"/>
-                <w:b/>
-                <w:bCs/>
               </w:rPr>
             </w:pPr>
             <w:r>
@@ -1170,21 +1134,19 @@
         </w:tc>
         <w:tc>
           <w:tcPr>
-            <w:tcW w:w="1212" w:type="dxa"/>
-            <w:tcBorders>
-              <w:left w:val="single" w:sz="2" w:space="0" w:color="000000"/>
-              <w:bottom w:val="single" w:sz="2" w:space="0" w:color="000000"/>
-            </w:tcBorders>
-          </w:tcPr>
-          <w:p>
-            <w:pPr>
-              <w:pStyle w:val="TableContents"/>
-              <w:bidi w:val="0"/>
-              <w:jc w:val="center"/>
-              <w:rPr>
-                <w:rFonts w:ascii="Times New Roman" w:hAnsi="Times New Roman"/>
-                <w:b/>
-                <w:bCs/>
+            <w:tcW w:w="1211" w:type="dxa"/>
+            <w:tcBorders>
+              <w:left w:val="single" w:sz="2" w:space="0" w:color="000000"/>
+              <w:bottom w:val="single" w:sz="2" w:space="0" w:color="000000"/>
+            </w:tcBorders>
+          </w:tcPr>
+          <w:p>
+            <w:pPr>
+              <w:pStyle w:val="TableContents"/>
+              <w:bidi w:val="0"/>
+              <w:jc w:val="center"/>
+              <w:rPr>
+                <w:rFonts w:ascii="Times New Roman" w:hAnsi="Times New Roman"/>
               </w:rPr>
             </w:pPr>
             <w:r>
@@ -1199,7 +1161,7 @@
         </w:tc>
         <w:tc>
           <w:tcPr>
-            <w:tcW w:w="1811" w:type="dxa"/>
+            <w:tcW w:w="1807" w:type="dxa"/>
             <w:vMerge w:val="restart"/>
             <w:tcBorders>
               <w:left w:val="single" w:sz="2" w:space="0" w:color="000000"/>
@@ -1224,7 +1186,7 @@
         </w:tc>
         <w:tc>
           <w:tcPr>
-            <w:tcW w:w="1027" w:type="dxa"/>
+            <w:tcW w:w="1032" w:type="dxa"/>
             <w:vMerge w:val="restart"/>
             <w:tcBorders>
               <w:left w:val="single" w:sz="2" w:space="0" w:color="000000"/>
@@ -1353,31 +1315,31 @@
         </w:tc>
         <w:tc>
           <w:tcPr>
-            <w:tcW w:w="1212" w:type="dxa"/>
-            <w:tcBorders>
-              <w:left w:val="single" w:sz="2" w:space="0" w:color="000000"/>
-              <w:bottom w:val="single" w:sz="2" w:space="0" w:color="000000"/>
-            </w:tcBorders>
-          </w:tcPr>
-          <w:p>
-            <w:pPr>
-              <w:pStyle w:val="TableContents"/>
-              <w:bidi w:val="0"/>
-              <w:jc w:val="center"/>
-              <w:rPr>
-                <w:rFonts w:ascii="Times New Roman" w:hAnsi="Times New Roman"/>
-              </w:rPr>
-            </w:pPr>
-            <w:r>
-              <w:rPr>
-                <w:rFonts w:ascii="Times New Roman" w:hAnsi="Times New Roman"/>
-              </w:rPr>
-            </w:r>
-          </w:p>
-        </w:tc>
-        <w:tc>
-          <w:tcPr>
-            <w:tcW w:w="1811" w:type="dxa"/>
+            <w:tcW w:w="1211" w:type="dxa"/>
+            <w:tcBorders>
+              <w:left w:val="single" w:sz="2" w:space="0" w:color="000000"/>
+              <w:bottom w:val="single" w:sz="2" w:space="0" w:color="000000"/>
+            </w:tcBorders>
+          </w:tcPr>
+          <w:p>
+            <w:pPr>
+              <w:pStyle w:val="TableContents"/>
+              <w:bidi w:val="0"/>
+              <w:jc w:val="center"/>
+              <w:rPr>
+                <w:rFonts w:ascii="Times New Roman" w:hAnsi="Times New Roman"/>
+              </w:rPr>
+            </w:pPr>
+            <w:r>
+              <w:rPr>
+                <w:rFonts w:ascii="Times New Roman" w:hAnsi="Times New Roman"/>
+              </w:rPr>
+            </w:r>
+          </w:p>
+        </w:tc>
+        <w:tc>
+          <w:tcPr>
+            <w:tcW w:w="1807" w:type="dxa"/>
             <w:vMerge w:val="continue"/>
             <w:tcBorders>
               <w:left w:val="single" w:sz="2" w:space="0" w:color="000000"/>
@@ -1402,7 +1364,7 @@
         </w:tc>
         <w:tc>
           <w:tcPr>
-            <w:tcW w:w="1027" w:type="dxa"/>
+            <w:tcW w:w="1032" w:type="dxa"/>
             <w:vMerge w:val="continue"/>
             <w:tcBorders>
               <w:left w:val="single" w:sz="2" w:space="0" w:color="000000"/>
@@ -1532,17 +1494,17 @@
               <w:jc w:val="center"/>
               <w:rPr>
                 <w:rFonts w:ascii="Times New Roman" w:hAnsi="Times New Roman"/>
-                <w:b/>
-                <w:bCs/>
-              </w:rPr>
-            </w:pPr>
-            <w:r>
-              <w:rPr>
-                <w:rFonts w:ascii="Times New Roman" w:hAnsi="Times New Roman"/>
-                <w:b/>
-                <w:bCs/>
-              </w:rPr>
-              <w:t>Pré-requisitos:</w:t>
+                <w:b w:val="false"/>
+                <w:bCs w:val="false"/>
+              </w:rPr>
+            </w:pPr>
+            <w:r>
+              <w:rPr>
+                <w:rFonts w:ascii="Times New Roman" w:hAnsi="Times New Roman"/>
+                <w:b/>
+                <w:bCs/>
+              </w:rPr>
+              <w:t xml:space="preserve">Pré-requisitos: </w:t>
             </w:r>
           </w:p>
         </w:tc>
@@ -1563,69 +1525,17 @@
               <w:jc w:val="center"/>
               <w:rPr>
                 <w:rFonts w:ascii="Times New Roman" w:hAnsi="Times New Roman"/>
-                <w:b/>
-                <w:bCs/>
-              </w:rPr>
-            </w:pPr>
-            <w:r>
-              <w:rPr>
-                <w:rFonts w:ascii="Times New Roman" w:hAnsi="Times New Roman"/>
-                <w:b/>
-                <w:bCs/>
-              </w:rPr>
-              <w:t>Correquisitos:</w:t>
-            </w:r>
-          </w:p>
-        </w:tc>
-      </w:tr>
-      <w:tr>
-        <w:trPr/>
-        <w:tc>
-          <w:tcPr>
-            <w:tcW w:w="4535" w:type="dxa"/>
-            <w:tcBorders>
-              <w:left w:val="single" w:sz="2" w:space="0" w:color="000000"/>
-              <w:bottom w:val="single" w:sz="2" w:space="0" w:color="000000"/>
-            </w:tcBorders>
-          </w:tcPr>
-          <w:p>
-            <w:pPr>
-              <w:pStyle w:val="TableContents"/>
-              <w:bidi w:val="0"/>
-              <w:jc w:val="center"/>
-              <w:rPr>
-                <w:rFonts w:ascii="Times New Roman" w:hAnsi="Times New Roman"/>
-              </w:rPr>
-            </w:pPr>
-            <w:r>
-              <w:rPr>
-                <w:rFonts w:ascii="Times New Roman" w:hAnsi="Times New Roman"/>
-              </w:rPr>
-            </w:r>
-          </w:p>
-        </w:tc>
-        <w:tc>
-          <w:tcPr>
-            <w:tcW w:w="4536" w:type="dxa"/>
-            <w:tcBorders>
-              <w:left w:val="single" w:sz="2" w:space="0" w:color="000000"/>
-              <w:bottom w:val="single" w:sz="2" w:space="0" w:color="000000"/>
-              <w:right w:val="single" w:sz="2" w:space="0" w:color="000000"/>
-            </w:tcBorders>
-          </w:tcPr>
-          <w:p>
-            <w:pPr>
-              <w:pStyle w:val="TableContents"/>
-              <w:bidi w:val="0"/>
-              <w:jc w:val="center"/>
-              <w:rPr>
-                <w:rFonts w:ascii="Times New Roman" w:hAnsi="Times New Roman"/>
-              </w:rPr>
-            </w:pPr>
-            <w:r>
-              <w:rPr>
-                <w:rFonts w:ascii="Times New Roman" w:hAnsi="Times New Roman"/>
-              </w:rPr>
+                <w:b w:val="false"/>
+                <w:bCs w:val="false"/>
+              </w:rPr>
+            </w:pPr>
+            <w:r>
+              <w:rPr>
+                <w:rFonts w:ascii="Times New Roman" w:hAnsi="Times New Roman"/>
+                <w:b/>
+                <w:bCs/>
+              </w:rPr>
+              <w:t xml:space="preserve">Correquisitos: </w:t>
             </w:r>
           </w:p>
         </w:tc>
@@ -1685,8 +1595,6 @@
               <w:jc w:val="center"/>
               <w:rPr>
                 <w:rFonts w:ascii="Times New Roman" w:hAnsi="Times New Roman"/>
-                <w:b/>
-                <w:bCs/>
               </w:rPr>
             </w:pPr>
             <w:r>
@@ -1785,8 +1693,6 @@
               <w:jc w:val="left"/>
               <w:rPr>
                 <w:rFonts w:ascii="Times New Roman" w:hAnsi="Times New Roman"/>
-                <w:b/>
-                <w:bCs/>
               </w:rPr>
             </w:pPr>
             <w:r>
@@ -1885,8 +1791,6 @@
               <w:jc w:val="left"/>
               <w:rPr>
                 <w:rFonts w:ascii="Times New Roman" w:hAnsi="Times New Roman"/>
-                <w:b/>
-                <w:bCs/>
               </w:rPr>
             </w:pPr>
             <w:r>
@@ -1948,8 +1852,6 @@
               <w:jc w:val="left"/>
               <w:rPr>
                 <w:rFonts w:ascii="Times New Roman" w:hAnsi="Times New Roman"/>
-                <w:b/>
-                <w:bCs/>
               </w:rPr>
             </w:pPr>
             <w:r>
@@ -2048,8 +1950,6 @@
               <w:jc w:val="left"/>
               <w:rPr>
                 <w:rFonts w:ascii="Times New Roman" w:hAnsi="Times New Roman"/>
-                <w:b/>
-                <w:bCs/>
               </w:rPr>
             </w:pPr>
             <w:r>
@@ -2079,8 +1979,6 @@
               <w:jc w:val="left"/>
               <w:rPr>
                 <w:rFonts w:ascii="Times New Roman" w:hAnsi="Times New Roman"/>
-                <w:b/>
-                <w:bCs/>
               </w:rPr>
             </w:pPr>
             <w:r>
@@ -2203,8 +2101,6 @@
               <w:jc w:val="center"/>
               <w:rPr>
                 <w:rFonts w:ascii="Times New Roman" w:hAnsi="Times New Roman"/>
-                <w:b/>
-                <w:bCs/>
               </w:rPr>
             </w:pPr>
             <w:r>
@@ -2268,8 +2164,6 @@
               <w:jc w:val="center"/>
               <w:rPr>
                 <w:rFonts w:ascii="Times New Roman" w:hAnsi="Times New Roman"/>
-                <w:b/>
-                <w:bCs/>
               </w:rPr>
             </w:pPr>
             <w:r>
@@ -2340,8 +2234,66 @@
         <w:jc w:val="center"/>
         <w:rPr>
           <w:rFonts w:ascii="Times New Roman" w:hAnsi="Times New Roman"/>
-          <w:b/>
-          <w:bCs/>
+        </w:rPr>
+      </w:pPr>
+      <w:r>
+        <w:rPr>
+          <w:rFonts w:ascii="Times New Roman" w:hAnsi="Times New Roman"/>
+        </w:rPr>
+      </w:r>
+    </w:p>
+    <w:p>
+      <w:pPr>
+        <w:pStyle w:val="Normal"/>
+        <w:bidi w:val="0"/>
+        <w:jc w:val="center"/>
+        <w:rPr>
+          <w:rFonts w:ascii="Times New Roman" w:hAnsi="Times New Roman"/>
+        </w:rPr>
+      </w:pPr>
+      <w:r>
+        <w:rPr>
+          <w:rFonts w:ascii="Times New Roman" w:hAnsi="Times New Roman"/>
+        </w:rPr>
+      </w:r>
+    </w:p>
+    <w:p>
+      <w:pPr>
+        <w:pStyle w:val="Normal"/>
+        <w:bidi w:val="0"/>
+        <w:jc w:val="center"/>
+        <w:rPr>
+          <w:rFonts w:ascii="Times New Roman" w:hAnsi="Times New Roman"/>
+        </w:rPr>
+      </w:pPr>
+      <w:r>
+        <w:rPr>
+          <w:rFonts w:ascii="Times New Roman" w:hAnsi="Times New Roman"/>
+        </w:rPr>
+      </w:r>
+    </w:p>
+    <w:p>
+      <w:pPr>
+        <w:pStyle w:val="Normal"/>
+        <w:bidi w:val="0"/>
+        <w:jc w:val="center"/>
+        <w:rPr>
+          <w:rFonts w:ascii="Times New Roman" w:hAnsi="Times New Roman"/>
+        </w:rPr>
+      </w:pPr>
+      <w:r>
+        <w:rPr>
+          <w:rFonts w:ascii="Times New Roman" w:hAnsi="Times New Roman"/>
+        </w:rPr>
+      </w:r>
+    </w:p>
+    <w:p>
+      <w:pPr>
+        <w:pStyle w:val="Normal"/>
+        <w:bidi w:val="0"/>
+        <w:jc w:val="center"/>
+        <w:rPr>
+          <w:rFonts w:ascii="Times New Roman" w:hAnsi="Times New Roman"/>
         </w:rPr>
       </w:pPr>
       <w:r>
@@ -2360,8 +2312,6 @@
         <w:jc w:val="center"/>
         <w:rPr>
           <w:rFonts w:ascii="Times New Roman" w:hAnsi="Times New Roman"/>
-          <w:b/>
-          <w:bCs/>
         </w:rPr>
       </w:pPr>
       <w:r>
@@ -2418,8 +2368,66 @@
         <w:jc w:val="center"/>
         <w:rPr>
           <w:rFonts w:ascii="Times New Roman" w:hAnsi="Times New Roman"/>
-          <w:b/>
-          <w:bCs/>
+        </w:rPr>
+      </w:pPr>
+      <w:r>
+        <w:rPr>
+          <w:rFonts w:ascii="Times New Roman" w:hAnsi="Times New Roman"/>
+        </w:rPr>
+      </w:r>
+    </w:p>
+    <w:p>
+      <w:pPr>
+        <w:pStyle w:val="Normal"/>
+        <w:bidi w:val="0"/>
+        <w:jc w:val="center"/>
+        <w:rPr>
+          <w:rFonts w:ascii="Times New Roman" w:hAnsi="Times New Roman"/>
+        </w:rPr>
+      </w:pPr>
+      <w:r>
+        <w:rPr>
+          <w:rFonts w:ascii="Times New Roman" w:hAnsi="Times New Roman"/>
+        </w:rPr>
+      </w:r>
+    </w:p>
+    <w:p>
+      <w:pPr>
+        <w:pStyle w:val="Normal"/>
+        <w:bidi w:val="0"/>
+        <w:jc w:val="center"/>
+        <w:rPr>
+          <w:rFonts w:ascii="Times New Roman" w:hAnsi="Times New Roman"/>
+        </w:rPr>
+      </w:pPr>
+      <w:r>
+        <w:rPr>
+          <w:rFonts w:ascii="Times New Roman" w:hAnsi="Times New Roman"/>
+        </w:rPr>
+      </w:r>
+    </w:p>
+    <w:p>
+      <w:pPr>
+        <w:pStyle w:val="Normal"/>
+        <w:bidi w:val="0"/>
+        <w:jc w:val="center"/>
+        <w:rPr>
+          <w:rFonts w:ascii="Times New Roman" w:hAnsi="Times New Roman"/>
+        </w:rPr>
+      </w:pPr>
+      <w:r>
+        <w:rPr>
+          <w:rFonts w:ascii="Times New Roman" w:hAnsi="Times New Roman"/>
+        </w:rPr>
+      </w:r>
+    </w:p>
+    <w:p>
+      <w:pPr>
+        <w:pStyle w:val="Normal"/>
+        <w:bidi w:val="0"/>
+        <w:jc w:val="center"/>
+        <w:rPr>
+          <w:rFonts w:ascii="Times New Roman" w:hAnsi="Times New Roman"/>
         </w:rPr>
       </w:pPr>
       <w:r>
@@ -2438,8 +2446,6 @@
         <w:jc w:val="center"/>
         <w:rPr>
           <w:rFonts w:ascii="Times New Roman" w:hAnsi="Times New Roman"/>
-          <w:b/>
-          <w:bCs/>
         </w:rPr>
       </w:pPr>
       <w:r>
@@ -2496,8 +2502,6 @@
         <w:jc w:val="center"/>
         <w:rPr>
           <w:rFonts w:ascii="Times New Roman" w:hAnsi="Times New Roman"/>
-          <w:b/>
-          <w:bCs/>
         </w:rPr>
       </w:pPr>
       <w:r>
@@ -2508,6 +2512,61 @@
         </w:rPr>
         <w:t xml:space="preserve"> </w:t>
       </w:r>
+    </w:p>
+    <w:p>
+      <w:pPr>
+        <w:pStyle w:val="Normal"/>
+        <w:bidi w:val="0"/>
+        <w:jc w:val="center"/>
+        <w:rPr>
+          <w:rFonts w:ascii="Times New Roman" w:hAnsi="Times New Roman"/>
+        </w:rPr>
+      </w:pPr>
+      <w:r>
+        <w:rPr>
+          <w:rFonts w:ascii="Times New Roman" w:hAnsi="Times New Roman"/>
+        </w:rPr>
+      </w:r>
+    </w:p>
+    <w:p>
+      <w:pPr>
+        <w:pStyle w:val="Normal"/>
+        <w:bidi w:val="0"/>
+        <w:jc w:val="center"/>
+        <w:rPr>
+          <w:rFonts w:ascii="Times New Roman" w:hAnsi="Times New Roman"/>
+        </w:rPr>
+      </w:pPr>
+      <w:r>
+        <w:rPr>
+          <w:rFonts w:ascii="Times New Roman" w:hAnsi="Times New Roman"/>
+        </w:rPr>
+      </w:r>
+    </w:p>
+    <w:p>
+      <w:pPr>
+        <w:pStyle w:val="Normal"/>
+        <w:bidi w:val="0"/>
+        <w:jc w:val="center"/>
+        <w:rPr>
+          <w:rFonts w:ascii="Times New Roman" w:hAnsi="Times New Roman"/>
+        </w:rPr>
+      </w:pPr>
+      <w:r>
+        <w:rPr>
+          <w:rFonts w:ascii="Times New Roman" w:hAnsi="Times New Roman"/>
+        </w:rPr>
+      </w:r>
+    </w:p>
+    <w:p>
+      <w:pPr>
+        <w:pStyle w:val="Normal"/>
+        <w:bidi w:val="0"/>
+        <w:jc w:val="center"/>
+        <w:rPr>
+          <w:rFonts w:ascii="Times New Roman" w:hAnsi="Times New Roman"/>
+        </w:rPr>
+      </w:pPr>
       <w:r>
         <w:rPr>
           <w:rFonts w:ascii="Times New Roman" w:hAnsi="Times New Roman"/>
@@ -2524,8 +2583,6 @@
         <w:jc w:val="center"/>
         <w:rPr>
           <w:rFonts w:ascii="Times New Roman" w:hAnsi="Times New Roman"/>
-          <w:b/>
-          <w:bCs/>
         </w:rPr>
       </w:pPr>
       <w:r>
@@ -2601,8 +2658,51 @@
         <w:jc w:val="center"/>
         <w:rPr>
           <w:rFonts w:ascii="Times New Roman" w:hAnsi="Times New Roman"/>
-          <w:b/>
-          <w:bCs/>
+        </w:rPr>
+      </w:pPr>
+      <w:r>
+        <w:rPr>
+          <w:rFonts w:ascii="Times New Roman" w:hAnsi="Times New Roman"/>
+        </w:rPr>
+      </w:r>
+    </w:p>
+    <w:p>
+      <w:pPr>
+        <w:pStyle w:val="Normal"/>
+        <w:bidi w:val="0"/>
+        <w:jc w:val="center"/>
+        <w:rPr>
+          <w:rFonts w:ascii="Times New Roman" w:hAnsi="Times New Roman"/>
+        </w:rPr>
+      </w:pPr>
+      <w:r>
+        <w:rPr>
+          <w:rFonts w:ascii="Times New Roman" w:hAnsi="Times New Roman"/>
+        </w:rPr>
+      </w:r>
+    </w:p>
+    <w:p>
+      <w:pPr>
+        <w:pStyle w:val="Normal"/>
+        <w:bidi w:val="0"/>
+        <w:jc w:val="center"/>
+        <w:rPr>
+          <w:rFonts w:ascii="Times New Roman" w:hAnsi="Times New Roman"/>
+        </w:rPr>
+      </w:pPr>
+      <w:r>
+        <w:rPr>
+          <w:rFonts w:ascii="Times New Roman" w:hAnsi="Times New Roman"/>
+        </w:rPr>
+      </w:r>
+    </w:p>
+    <w:p>
+      <w:pPr>
+        <w:pStyle w:val="Normal"/>
+        <w:bidi w:val="0"/>
+        <w:jc w:val="center"/>
+        <w:rPr>
+          <w:rFonts w:ascii="Times New Roman" w:hAnsi="Times New Roman"/>
         </w:rPr>
       </w:pPr>
       <w:r>
@@ -2621,8 +2721,6 @@
         <w:jc w:val="center"/>
         <w:rPr>
           <w:rFonts w:ascii="Times New Roman" w:hAnsi="Times New Roman"/>
-          <w:b/>
-          <w:bCs/>
         </w:rPr>
       </w:pPr>
       <w:r>
@@ -2632,6 +2730,29 @@
           <w:bCs/>
         </w:rPr>
         <w:t>ASSINATURA DO COORDENADOR DO CURSO</w:t>
+      </w:r>
+      <w:r>
+        <w:br w:type="page"/>
+      </w:r>
+    </w:p>
+    <w:p>
+      <w:pPr>
+        <w:pStyle w:val="Normal"/>
+        <w:bidi w:val="0"/>
+        <w:spacing w:before="0" w:after="0"/>
+        <w:jc w:val="center"/>
+        <w:rPr>
+          <w:rFonts w:ascii="Times New Roman" w:hAnsi="Times New Roman"/>
+          <w:b/>
+          <w:bCs/>
+        </w:rPr>
+      </w:pPr>
+      <w:r>
+        <w:rPr>
+          <w:rFonts w:ascii="Times New Roman" w:hAnsi="Times New Roman"/>
+          <w:b/>
+          <w:bCs/>
+        </w:rPr>
       </w:r>
     </w:p>
     <w:sectPr>
@@ -2641,6 +2762,7 @@
       <w:pgNumType w:fmt="decimal"/>
       <w:formProt w:val="false"/>
       <w:textDirection w:val="lrTb"/>
+      <w:docGrid w:type="default" w:linePitch="100" w:charSpace="0"/>
     </w:sectPr>
   </w:body>
 </w:document>
@@ -2660,7 +2782,6 @@
     </w:rPrDefault>
     <w:pPrDefault>
       <w:pPr>
-        <w:widowControl/>
         <w:suppressAutoHyphens w:val="true"/>
       </w:pPr>
     </w:pPrDefault>
@@ -2670,15 +2791,26 @@
     <w:qFormat/>
     <w:pPr>
       <w:widowControl/>
+      <w:suppressAutoHyphens w:val="true"/>
       <w:bidi w:val="0"/>
+      <w:spacing w:before="0" w:after="0"/>
+      <w:jc w:val="left"/>
     </w:pPr>
     <w:rPr>
       <w:rFonts w:ascii="Liberation Serif" w:hAnsi="Liberation Serif" w:eastAsia="Noto Serif CJK SC" w:cs="FreeSans"/>
+      <w:caps/>
       <w:color w:val="auto"/>
       <w:kern w:val="2"/>
       <w:sz w:val="24"/>
       <w:szCs w:val="24"/>
       <w:lang w:val="pt-BR" w:eastAsia="zh-CN" w:bidi="hi-IN"/>
+    </w:rPr>
+  </w:style>
+  <w:style w:type="character" w:styleId="Bulletsuser">
+    <w:name w:val="Bullets (user)"/>
+    <w:qFormat/>
+    <w:rPr>
+      <w:rFonts w:ascii="OpenSymbol" w:hAnsi="OpenSymbol" w:eastAsia="OpenSymbol" w:cs="OpenSymbol"/>
     </w:rPr>
   </w:style>
   <w:style w:type="paragraph" w:styleId="Heading">
@@ -2760,6 +2892,47 @@
     <w:rPr>
       <w:b/>
       <w:bCs/>
+    </w:rPr>
+  </w:style>
+  <w:style w:type="paragraph" w:styleId="Title">
+    <w:name w:val="Title"/>
+    <w:basedOn w:val="Heading"/>
+    <w:next w:val="BodyText"/>
+    <w:qFormat/>
+    <w:pPr>
+      <w:jc w:val="center"/>
+    </w:pPr>
+    <w:rPr>
+      <w:b/>
+      <w:bCs/>
+      <w:sz w:val="56"/>
+      <w:szCs w:val="56"/>
+    </w:rPr>
+  </w:style>
+  <w:style w:type="paragraph" w:styleId="HeaderandFooter">
+    <w:name w:val="Header and Footer"/>
+    <w:basedOn w:val="Normal"/>
+    <w:qFormat/>
+    <w:pPr>
+      <w:suppressLineNumbers/>
+      <w:tabs>
+        <w:tab w:val="clear" w:pos="709"/>
+        <w:tab w:val="center" w:pos="4535" w:leader="none"/>
+        <w:tab w:val="right" w:pos="9071" w:leader="none"/>
+      </w:tabs>
+    </w:pPr>
+    <w:rPr/>
+  </w:style>
+  <w:style w:type="paragraph" w:styleId="Header">
+    <w:name w:val="header"/>
+    <w:basedOn w:val="HeaderandFooter"/>
+    <w:pPr>
+      <w:suppressLineNumbers/>
+      <w:jc w:val="center"/>
+    </w:pPr>
+    <w:rPr>
+      <w:rFonts w:ascii="Times New Roman" w:hAnsi="Times New Roman"/>
+      <w:b/>
     </w:rPr>
   </w:style>
 </w:styles>

</xml_diff>